<commit_message>
docs(lab4): replace quality dashboard figure
</commit_message>
<xml_diff>
--- a/实验四_软件质量工程与AI辅助代码审查/D4-7_质量度量看板截图.docx
+++ b/实验四_软件质量工程与AI辅助代码审查/D4-7_质量度量看板截图.docx
@@ -686,6 +686,10 @@
               <w:jc w:val="center"/>
             </w:pPr>
             <w:r>
+              <w:rPr>
+                <w:rFonts w:ascii="Microsoft YaHei" w:hAnsi="Microsoft YaHei" w:eastAsia="Microsoft YaHei"/>
+                <w:i w:val="0"/>
+              </w:rPr>
               <w:t>图4-5 质量度量看板示意</w:t>
             </w:r>
           </w:p>
@@ -2401,6 +2405,7 @@
     <w:rPr>
       <w:b/>
       <w:bCs/>
+      <w:i w:val="0"/>
       <w:color w:val="4F81BD" w:themeColor="accent1"/>
       <w:sz w:val="18"/>
       <w:szCs w:val="18"/>

</xml_diff>